<commit_message>
Fix README repository section and fill report repository details
Co-Authored-By: Claude Sonnet 5.5 <noreply@anthropic.com>
Claude-Session: https://claude.ai/code/session_01WCdTyJdAUErbgwUvnLoAdm
</commit_message>
<xml_diff>
--- a/DCOMP320_StackLens_Report.docx
+++ b/DCOMP320_StackLens_Report.docx
@@ -241,7 +241,7 @@
           <w:i w:val="0"/>
           <w:sz w:val="22"/>
         </w:rPr>
-        <w:t>GitHub repository: ________________________________________</w:t>
+        <w:t>GitHub repository: dcomp320-stacklens</w:t>
       </w:r>
     </w:p>
     <w:p>
@@ -9037,7 +9037,7 @@
           <w:b w:val="0"/>
           <w:i w:val="0"/>
         </w:rPr>
-        <w:t>Because the page is static, it can also be published on GitHub Pages, which gives the project a live web link that anyone can open.</w:t>
+        <w:t>Because the page is static, it could also be published on GitHub Pages to give the project a live web link.</w:t>
       </w:r>
     </w:p>
     <w:p>
@@ -17223,20 +17223,7 @@
           <w:b w:val="0"/>
           <w:i w:val="0"/>
         </w:rPr>
-        <w:t>Repository link: ____________________________________________________</w:t>
-      </w:r>
-    </w:p>
-    <w:p>
-      <w:pPr>
-        <w:jc w:val="left"/>
-      </w:pPr>
-      <w:r>
-        <w:rPr>
-          <w:rFonts w:ascii="Tahoma" w:hAnsi="Tahoma"/>
-          <w:b w:val="0"/>
-          <w:i w:val="0"/>
-        </w:rPr>
-        <w:t>Live visualizer link (GitHub Pages, optional): _______________________________</w:t>
+        <w:t>Repository link: https://github.com/AbdulaiBah479/dcomp320-stacklens</w:t>
       </w:r>
     </w:p>
     <w:p>

</xml_diff>

<commit_message>
Polish report: lecturer name in conclusion, resize figures for cleaner pages
Co-Authored-By: Claude Sonnet 5.5 <noreply@anthropic.com>
Claude-Session: https://claude.ai/code/session_01WCdTyJdAUErbgwUvnLoAdm
</commit_message>
<xml_diff>
--- a/DCOMP320_StackLens_Report.docx
+++ b/DCOMP320_StackLens_Report.docx
@@ -6361,7 +6361,7 @@
       <w:r>
         <w:drawing>
           <wp:inline xmlns:a="http://schemas.openxmlformats.org/drawingml/2006/main" xmlns:pic="http://schemas.openxmlformats.org/drawingml/2006/picture">
-            <wp:extent cx="2736000" cy="5264385"/>
+            <wp:extent cx="2095505" cy="4031999"/>
             <wp:docPr id="2" name="Picture 2"/>
             <wp:cNvGraphicFramePr>
               <a:graphicFrameLocks noChangeAspect="1"/>
@@ -6382,7 +6382,7 @@
                   <pic:spPr>
                     <a:xfrm>
                       <a:off x="0" y="0"/>
-                      <a:ext cx="2736000" cy="5264385"/>
+                      <a:ext cx="2095505" cy="4031999"/>
                     </a:xfrm>
                     <a:prstGeom prst="rect"/>
                   </pic:spPr>
@@ -8873,7 +8873,7 @@
       <w:r>
         <w:drawing>
           <wp:inline xmlns:a="http://schemas.openxmlformats.org/drawingml/2006/main" xmlns:pic="http://schemas.openxmlformats.org/drawingml/2006/picture">
-            <wp:extent cx="5112000" cy="3725695"/>
+            <wp:extent cx="4247999" cy="3096000"/>
             <wp:docPr id="3" name="Picture 3"/>
             <wp:cNvGraphicFramePr>
               <a:graphicFrameLocks noChangeAspect="1"/>
@@ -8894,7 +8894,7 @@
                   <pic:spPr>
                     <a:xfrm>
                       <a:off x="0" y="0"/>
-                      <a:ext cx="5112000" cy="3725695"/>
+                      <a:ext cx="4247999" cy="3096000"/>
                     </a:xfrm>
                     <a:prstGeom prst="rect"/>
                   </pic:spPr>
@@ -8927,7 +8927,7 @@
       <w:r>
         <w:drawing>
           <wp:inline xmlns:a="http://schemas.openxmlformats.org/drawingml/2006/main" xmlns:pic="http://schemas.openxmlformats.org/drawingml/2006/picture">
-            <wp:extent cx="5112000" cy="3725695"/>
+            <wp:extent cx="4247999" cy="3096000"/>
             <wp:docPr id="4" name="Picture 4"/>
             <wp:cNvGraphicFramePr>
               <a:graphicFrameLocks noChangeAspect="1"/>
@@ -8948,7 +8948,7 @@
                   <pic:spPr>
                     <a:xfrm>
                       <a:off x="0" y="0"/>
-                      <a:ext cx="5112000" cy="3725695"/>
+                      <a:ext cx="4247999" cy="3096000"/>
                     </a:xfrm>
                     <a:prstGeom prst="rect"/>
                   </pic:spPr>
@@ -8981,7 +8981,7 @@
       <w:r>
         <w:drawing>
           <wp:inline xmlns:a="http://schemas.openxmlformats.org/drawingml/2006/main" xmlns:pic="http://schemas.openxmlformats.org/drawingml/2006/picture">
-            <wp:extent cx="1872000" cy="4051200"/>
+            <wp:extent cx="1580331" cy="3420000"/>
             <wp:docPr id="5" name="Picture 5"/>
             <wp:cNvGraphicFramePr>
               <a:graphicFrameLocks noChangeAspect="1"/>
@@ -9002,7 +9002,7 @@
                   <pic:spPr>
                     <a:xfrm>
                       <a:off x="0" y="0"/>
-                      <a:ext cx="1872000" cy="4051200"/>
+                      <a:ext cx="1580331" cy="3420000"/>
                     </a:xfrm>
                     <a:prstGeom prst="rect"/>
                   </pic:spPr>
@@ -17202,7 +17202,7 @@
           <w:b/>
           <w:i w:val="0"/>
         </w:rPr>
-        <w:t>GitHub.</w:t>
+        <w:t>GitHub. The project is hosted on GitHub in the repository dcomp320-stacklens, and the lecturer, Hawa Kallon, has been added as a collaborator, as required by the assignment.</w:t>
       </w:r>
       <w:r>
         <w:rPr>
@@ -17210,7 +17210,6 @@
           <w:b w:val="0"/>
           <w:i w:val="0"/>
         </w:rPr>
-        <w:t xml:space="preserve"> The project has been pushed to GitHub and the lecturer has been added as a collaborator, as required by the assignment.</w:t>
       </w:r>
     </w:p>
     <w:p>
@@ -17224,19 +17223,6 @@
           <w:i w:val="0"/>
         </w:rPr>
         <w:t>Repository link: https://github.com/AbdulaiBah479/dcomp320-stacklens</w:t>
-      </w:r>
-    </w:p>
-    <w:p>
-      <w:pPr>
-        <w:jc w:val="left"/>
-      </w:pPr>
-      <w:r>
-        <w:rPr>
-          <w:rFonts w:ascii="Tahoma" w:hAnsi="Tahoma"/>
-          <w:b w:val="0"/>
-          <w:i w:val="0"/>
-        </w:rPr>
-        <w:t>Lecturer added as collaborator on (date): ______________________</w:t>
       </w:r>
     </w:p>
     <w:p>

</xml_diff>